<commit_message>
Publish updated Wisdom Stories across four languages, with author filtering and audio controls hidden until files exist.
Co-authored-by: Cursor <cursoragent@cursor.com>
</commit_message>
<xml_diff>
--- a/az/wisdom-stories/blessings-god-has-given.docx
+++ b/az/wisdom-stories/blessings-god-has-given.docx
@@ -15,7 +15,7 @@
         <w:spacing w:after="80"/>
       </w:pPr>
       <w:r>
-        <w:t>Allah kimə nemət veribsə, ondan necə istifadə etdiyinə də baxacaq:</w:t>
+        <w:t>Allah kimə nə nemət veribsə, ondan necə istifadə etdiyinə də baxacaq:</w:t>
       </w:r>
     </w:p>
     <w:p>
@@ -77,11 +77,9 @@
         <w:rPr>
           <w:b/>
         </w:rPr>
-        <w:t>İbrət:</w:t>
+        <w:t>İbrət: Hər nemət həm də bir imtahandır. Sənin kimliyini qazandıqların deyil, onlardan necə istifadə etdiyin göstərir.</w:t>
       </w:r>
-      <w:r>
-        <w:t xml:space="preserve"> Hər nemət həm də bir imtahandır. Sənin kimliyini qazandıqların deyil, onlardan necə istifadə etdiyin göstərir.</w:t>
-      </w:r>
+      <w:r/>
     </w:p>
     <w:p>
       <w:pPr>
@@ -92,7 +90,7 @@
           <w:i/>
           <w:sz w:val="18"/>
         </w:rPr>
-        <w:t>Hekayə açıq İnternet mənbələrindən əldə olunub.</w:t>
+        <w:t>Stories are taken from open Internet sources; illustrations were created with AI.</w:t>
       </w:r>
     </w:p>
     <w:sectPr>

</xml_diff>